<commit_message>
* fixed ETCE e08
</commit_message>
<xml_diff>
--- a/Emerging-Technologies-for-the-Circular-Economy/Exercises/E08-Food-Production.docx
+++ b/Emerging-Technologies-for-the-Circular-Economy/Exercises/E08-Food-Production.docx
@@ -20,7 +20,7 @@
         <mc:AlternateContent>
           <mc:Choice Requires="wpg">
             <w:drawing>
-              <wp:anchor distT="0" distB="3175" distL="0" distR="0" simplePos="0" relativeHeight="8" behindDoc="1" locked="0" layoutInCell="0" allowOverlap="1">
+              <wp:anchor distT="0" distB="3175" distL="0" distR="0" simplePos="0" relativeHeight="5" behindDoc="1" locked="0" layoutInCell="0" allowOverlap="1">
                 <wp:simplePos x="0" y="0"/>
                 <wp:positionH relativeFrom="page">
                   <wp:posOffset>2438400</wp:posOffset>
@@ -57,16 +57,16 @@
                           <wps:cNvSpPr/>
                           <wps:spPr>
                             <a:xfrm>
-                              <a:off x="4871160" y="0"/>
-                              <a:ext cx="514440" cy="11600280"/>
+                              <a:off x="4871880" y="0"/>
+                              <a:ext cx="513720" cy="11600280"/>
                             </a:xfrm>
                             <a:custGeom>
                               <a:avLst/>
                               <a:gdLst>
-                                <a:gd name="textAreaLeft" fmla="*/ 0 w 291600"/>
-                                <a:gd name="textAreaRight" fmla="*/ 293040 w 291600"/>
+                                <a:gd name="textAreaLeft" fmla="*/ 0 w 291240"/>
+                                <a:gd name="textAreaRight" fmla="*/ 293040 w 291240"/>
                                 <a:gd name="textAreaTop" fmla="*/ 0 h 6576480"/>
-                                <a:gd name="textAreaBottom" fmla="*/ 6577920 h 6576480"/>
+                                <a:gd name="textAreaBottom" fmla="*/ 6578280 h 6576480"/>
                               </a:gdLst>
                               <a:ahLst/>
                               <a:cxnLst/>
@@ -178,16 +178,7 @@
           <w:szCs w:val="44"/>
           <w:lang w:val="de-DE" w:eastAsia="de-DE"/>
         </w:rPr>
-        <w:t xml:space="preserve">Exercise – </w:t>
-      </w:r>
-      <w:r>
-        <w:rPr>
-          <w:rFonts w:ascii="DejaVu Sans" w:hAnsi="DejaVu Sans"/>
-          <w:sz w:val="44"/>
-          <w:szCs w:val="44"/>
-          <w:lang w:val="de-DE" w:eastAsia="de-DE"/>
-        </w:rPr>
-        <w:t>8</w:t>
+        <w:t>Exercise – 8</w:t>
       </w:r>
     </w:p>
     <w:p>
@@ -255,20 +246,7 @@
           <w:szCs w:val="22"/>
           <w:lang w:val="de-DE" w:eastAsia="zh-CN" w:bidi="ar-SA"/>
         </w:rPr>
-        <w:t>0</w:t>
-      </w:r>
-      <w:r>
-        <w:rPr>
-          <w:rFonts w:eastAsia="Calibri" w:cs="Calibri" w:ascii="DejaVu Sans" w:hAnsi="DejaVu Sans"/>
-          <w:b w:val="false"/>
-          <w:bCs w:val="false"/>
-          <w:color w:val="000000"/>
-          <w:spacing w:val="0"/>
-          <w:sz w:val="22"/>
-          <w:szCs w:val="22"/>
-          <w:lang w:val="de-DE" w:eastAsia="zh-CN" w:bidi="ar-SA"/>
-        </w:rPr>
-        <w:t>6</w:t>
+        <w:t>06</w:t>
       </w:r>
       <w:r>
         <w:rPr>
@@ -277,25 +255,7 @@
           <w:bCs w:val="false"/>
           <w:lang w:val="de-DE"/>
         </w:rPr>
-        <w:t>.0</w:t>
-      </w:r>
-      <w:r>
-        <w:rPr>
-          <w:rFonts w:ascii="DejaVu Sans" w:hAnsi="DejaVu Sans"/>
-          <w:b w:val="false"/>
-          <w:bCs w:val="false"/>
-          <w:lang w:val="de-DE"/>
-        </w:rPr>
-        <w:t>7</w:t>
-      </w:r>
-      <w:r>
-        <w:rPr>
-          <w:rFonts w:ascii="DejaVu Sans" w:hAnsi="DejaVu Sans"/>
-          <w:b w:val="false"/>
-          <w:bCs w:val="false"/>
-          <w:lang w:val="de-DE"/>
-        </w:rPr>
-        <w:t>.2026</w:t>
+        <w:t>.07.2026</w:t>
       </w:r>
     </w:p>
     <w:p>
@@ -332,20 +292,7 @@
           <w:szCs w:val="22"/>
           <w:lang w:val="de-DE" w:eastAsia="zh-CN" w:bidi="ar-SA"/>
         </w:rPr>
-        <w:t>1</w:t>
-      </w:r>
-      <w:r>
-        <w:rPr>
-          <w:rFonts w:eastAsia="Calibri" w:cs="Calibri" w:ascii="DejaVu Sans" w:hAnsi="DejaVu Sans"/>
-          <w:b w:val="false"/>
-          <w:bCs w:val="false"/>
-          <w:color w:val="000000"/>
-          <w:spacing w:val="0"/>
-          <w:sz w:val="22"/>
-          <w:szCs w:val="22"/>
-          <w:lang w:val="de-DE" w:eastAsia="zh-CN" w:bidi="ar-SA"/>
-        </w:rPr>
-        <w:t>3</w:t>
+        <w:t>13</w:t>
       </w:r>
       <w:r>
         <w:rPr>
@@ -367,20 +314,7 @@
           <w:szCs w:val="22"/>
           <w:lang w:val="de-DE" w:eastAsia="zh-CN" w:bidi="ar-SA"/>
         </w:rPr>
-        <w:t>0</w:t>
-      </w:r>
-      <w:r>
-        <w:rPr>
-          <w:rFonts w:eastAsia="Calibri" w:cs="Calibri" w:ascii="DejaVu Sans" w:hAnsi="DejaVu Sans"/>
-          <w:b w:val="false"/>
-          <w:bCs w:val="false"/>
-          <w:color w:val="000000"/>
-          <w:spacing w:val="0"/>
-          <w:sz w:val="22"/>
-          <w:szCs w:val="22"/>
-          <w:lang w:val="de-DE" w:eastAsia="zh-CN" w:bidi="ar-SA"/>
-        </w:rPr>
-        <w:t>7</w:t>
+        <w:t>07</w:t>
       </w:r>
       <w:r>
         <w:rPr>
@@ -508,43 +442,7 @@
           <w:bCs/>
           <w:lang w:val="de-DE" w:eastAsia="de-DE"/>
         </w:rPr>
-        <w:t>The exercise should be visible to you in the folder titled „ETCE-Exercise-Solutions/E0</w:t>
-      </w:r>
-      <w:r>
-        <w:rPr>
-          <w:rFonts w:ascii="DejaVu Sans" w:hAnsi="DejaVu Sans"/>
-          <w:b/>
-          <w:bCs/>
-          <w:lang w:val="de-DE" w:eastAsia="de-DE"/>
-        </w:rPr>
-        <w:t>8</w:t>
-      </w:r>
-      <w:r>
-        <w:rPr>
-          <w:rFonts w:ascii="DejaVu Sans" w:hAnsi="DejaVu Sans"/>
-          <w:b/>
-          <w:bCs/>
-          <w:lang w:val="de-DE" w:eastAsia="de-DE"/>
-        </w:rPr>
-        <w:t>“. The older project will not contain E0</w:t>
-      </w:r>
-      <w:r>
-        <w:rPr>
-          <w:rFonts w:ascii="DejaVu Sans" w:hAnsi="DejaVu Sans"/>
-          <w:b/>
-          <w:bCs/>
-          <w:lang w:val="de-DE" w:eastAsia="de-DE"/>
-        </w:rPr>
-        <w:t>8</w:t>
-      </w:r>
-      <w:r>
-        <w:rPr>
-          <w:rFonts w:ascii="DejaVu Sans" w:hAnsi="DejaVu Sans"/>
-          <w:b/>
-          <w:bCs/>
-          <w:lang w:val="de-DE" w:eastAsia="de-DE"/>
-        </w:rPr>
-        <w:t>.</w:t>
+        <w:t>The exercise should be visible to you in the folder titled „ETCE-Exercise-Solutions/E08“. The older project will not contain E08.</w:t>
       </w:r>
     </w:p>
     <w:p>
@@ -770,337 +668,16 @@
         </w:rPr>
       </w:pPr>
       <w:r>
-        <w:rPr>
-          <w:rFonts w:ascii="DejaVu Sans" w:hAnsi="DejaVu Sans"/>
-        </w:rPr>
-      </w:r>
-      <w:r>
-        <w:br w:type="page"/>
-      </w:r>
-    </w:p>
-    <w:p>
-      <w:pPr>
-        <w:pStyle w:val="Normal"/>
-        <w:widowControl/>
-        <w:numPr>
-          <w:ilvl w:val="0"/>
-          <w:numId w:val="0"/>
-        </w:numPr>
-        <w:shd w:val="clear" w:color="FFFFFF" w:fill="FFFFFF"/>
-        <w:tabs>
-          <w:tab w:val="clear" w:pos="720"/>
-          <w:tab w:val="left" w:pos="567" w:leader="none"/>
-        </w:tabs>
-        <w:spacing w:lineRule="exact" w:line="340" w:before="0" w:after="120"/>
-        <w:ind w:hanging="0" w:left="0" w:right="0"/>
-        <w:jc w:val="left"/>
-        <w:rPr>
-          <w:rFonts w:ascii="DejaVu Sans" w:hAnsi="DejaVu Sans"/>
-        </w:rPr>
-      </w:pPr>
-      <w:r>
-        <w:rPr>
-          <w:rFonts w:ascii="DejaVu Sans" w:hAnsi="DejaVu Sans"/>
-          <w:u w:val="single"/>
-          <w:lang w:val="de-DE" w:eastAsia="de-DE"/>
-        </w:rPr>
-        <w:t xml:space="preserve">Task – IoT </w:t>
-      </w:r>
-      <w:r>
-        <w:rPr>
-          <w:rFonts w:eastAsia="Calibri" w:cs="Calibri" w:ascii="DejaVu Sans" w:hAnsi="DejaVu Sans"/>
-          <w:color w:val="000000"/>
-          <w:spacing w:val="0"/>
-          <w:sz w:val="22"/>
-          <w:szCs w:val="22"/>
-          <w:u w:val="single"/>
-          <w:lang w:val="de-DE" w:eastAsia="de-DE" w:bidi="ar-SA"/>
-        </w:rPr>
-        <w:t>Security</w:t>
-      </w:r>
-      <w:r>
-        <w:rPr>
-          <w:rFonts w:ascii="DejaVu Sans" w:hAnsi="DejaVu Sans"/>
-          <w:u w:val="single"/>
-          <w:lang w:val="de-DE" w:eastAsia="de-DE"/>
-        </w:rPr>
-        <w:t xml:space="preserve"> – </w:t>
-      </w:r>
-      <w:r>
-        <w:rPr>
-          <w:rFonts w:eastAsia="Calibri" w:cs="Calibri" w:ascii="DejaVu Sans" w:hAnsi="DejaVu Sans"/>
-          <w:color w:val="000000"/>
-          <w:sz w:val="22"/>
-          <w:szCs w:val="22"/>
-          <w:u w:val="single"/>
-          <w:lang w:val="de-DE" w:eastAsia="de-DE" w:bidi="ar-SA"/>
-        </w:rPr>
-        <w:t>Energy sellers</w:t>
-      </w:r>
-    </w:p>
-    <w:p>
-      <w:pPr>
-        <w:pStyle w:val="BodyText"/>
-        <w:shd w:val="clear" w:color="FFFFFF" w:fill="FFFFFF"/>
-        <w:tabs>
-          <w:tab w:val="clear" w:pos="720"/>
-          <w:tab w:val="left" w:pos="744" w:leader="none"/>
-        </w:tabs>
-        <w:spacing w:lineRule="exact" w:line="340" w:before="0" w:after="120"/>
-        <w:jc w:val="both"/>
-        <w:rPr>
-          <w:rFonts w:ascii="DejaVu Sans" w:hAnsi="DejaVu Sans"/>
-        </w:rPr>
-      </w:pPr>
-      <w:r>
-        <w:rPr>
-          <w:rFonts w:ascii="DejaVu Sans" w:hAnsi="DejaVu Sans"/>
-          <w:color w:val="0E101A"/>
-        </w:rPr>
-        <w:t xml:space="preserve">In E05 and E06, you first gathered weather data from different sources (weather sensors/APIs) and aggregated them into a single data set. Subsequently, you processed the data to make predictions based on the results of the gathered information. However, so far, we have discarded the aspect of privacy and security when handling IoT-related data. Especially the transmission of data from the sensors to the processing entity (cloud, edge, etc.) is often prone to data manipulation. Moreover, the sensor data might contain sensitive information that is not meant to be public. Therefore, data in transit must be protected against manipulation and encrypted. In this exercise, the Energy Seller and the Buyer will establish a secure communication channel over a public (“evesdroppable”) communication channel, by performing an </w:t>
-      </w:r>
-      <w:hyperlink r:id="rId4">
-        <w:r>
-          <w:rPr>
-            <w:rStyle w:val="Hyperlink"/>
-            <w:rFonts w:ascii="DejaVu Sans" w:hAnsi="DejaVu Sans"/>
-            <w:color w:val="0E101A"/>
-          </w:rPr>
-          <w:t>ECDH (Elliptic Curve Diffie-Hellman) Key Exchange</w:t>
-        </w:r>
-      </w:hyperlink>
-      <w:r>
-        <w:rPr>
-          <w:rStyle w:val="Hyperlink"/>
-          <w:rFonts w:ascii="DejaVu Sans" w:hAnsi="DejaVu Sans"/>
-          <w:color w:val="0E101A"/>
-        </w:rPr>
-        <w:t>:</w:t>
-      </w:r>
-    </w:p>
-    <w:p>
-      <w:pPr>
-        <w:pStyle w:val="BodyText"/>
-        <w:shd w:val="clear" w:color="FFFFFF" w:fill="FFFFFF"/>
-        <w:spacing w:before="0" w:after="0"/>
-        <w:rPr>
-          <w:rFonts w:ascii="DejaVu Sans" w:hAnsi="DejaVu Sans"/>
-        </w:rPr>
-      </w:pPr>
-      <w:r>
-        <w:rPr>
-          <w:rFonts w:ascii="DejaVu Sans" w:hAnsi="DejaVu Sans"/>
-          <w:color w:val="0E101A"/>
-          <w:u w:val="single"/>
-        </w:rPr>
-        <w:t>Steps:</w:t>
-      </w:r>
-    </w:p>
-    <w:p>
-      <w:pPr>
-        <w:pStyle w:val="BodyText"/>
-        <w:numPr>
-          <w:ilvl w:val="1"/>
-          <w:numId w:val="3"/>
-        </w:numPr>
-        <w:shd w:val="clear" w:color="FFFFFF" w:fill="FFFFFF"/>
-        <w:tabs>
-          <w:tab w:val="clear" w:pos="720"/>
-          <w:tab w:val="left" w:pos="0" w:leader="none"/>
-        </w:tabs>
-        <w:spacing w:before="0" w:after="0"/>
-        <w:ind w:hanging="283" w:left="1414" w:right="0"/>
-        <w:rPr>
-          <w:rFonts w:ascii="DejaVu Sans" w:hAnsi="DejaVu Sans"/>
-        </w:rPr>
-      </w:pPr>
-      <w:r>
-        <w:rPr>
-          <w:rFonts w:ascii="DejaVu Sans" w:hAnsi="DejaVu Sans"/>
-          <w:color w:val="0E101A"/>
-        </w:rPr>
-        <w:t>Use Argon2id and the provided salt to derive a key from the password "ETCE-SS2021-this-is-safe" (without quotes).</w:t>
-      </w:r>
-    </w:p>
-    <w:p>
-      <w:pPr>
-        <w:pStyle w:val="BodyText"/>
-        <w:numPr>
-          <w:ilvl w:val="1"/>
-          <w:numId w:val="3"/>
-        </w:numPr>
-        <w:shd w:val="clear" w:color="FFFFFF" w:fill="FFFFFF"/>
-        <w:tabs>
-          <w:tab w:val="clear" w:pos="720"/>
-          <w:tab w:val="left" w:pos="0" w:leader="none"/>
-        </w:tabs>
-        <w:spacing w:before="0" w:after="0"/>
-        <w:ind w:hanging="283" w:left="1414" w:right="0"/>
-        <w:rPr>
-          <w:rFonts w:ascii="DejaVu Sans" w:hAnsi="DejaVu Sans"/>
-        </w:rPr>
-      </w:pPr>
-      <w:r>
-        <w:rPr>
-          <w:rFonts w:ascii="DejaVu Sans" w:hAnsi="DejaVu Sans"/>
-          <w:color w:val="0E101A"/>
-        </w:rPr>
-        <w:t>Load and decrypt the provided private key to be used by your node using the derived key.</w:t>
-      </w:r>
-    </w:p>
-    <w:p>
-      <w:pPr>
-        <w:pStyle w:val="BodyText"/>
-        <w:numPr>
-          <w:ilvl w:val="1"/>
-          <w:numId w:val="3"/>
-        </w:numPr>
-        <w:shd w:val="clear" w:color="FFFFFF" w:fill="FFFFFF"/>
-        <w:tabs>
-          <w:tab w:val="clear" w:pos="720"/>
-          <w:tab w:val="left" w:pos="0" w:leader="none"/>
-        </w:tabs>
-        <w:spacing w:before="0" w:after="0"/>
-        <w:ind w:hanging="283" w:left="1414" w:right="0"/>
-        <w:rPr>
-          <w:rFonts w:ascii="DejaVu Sans" w:hAnsi="DejaVu Sans"/>
-        </w:rPr>
-      </w:pPr>
-      <w:r>
-        <w:rPr>
-          <w:rFonts w:ascii="DejaVu Sans" w:hAnsi="DejaVu Sans"/>
-          <w:color w:val="0E101A"/>
-        </w:rPr>
-        <w:t>Load the provided public key of your peer.</w:t>
-      </w:r>
-    </w:p>
-    <w:p>
-      <w:pPr>
-        <w:pStyle w:val="BodyText"/>
-        <w:numPr>
-          <w:ilvl w:val="1"/>
-          <w:numId w:val="3"/>
-        </w:numPr>
-        <w:shd w:val="clear" w:color="FFFFFF" w:fill="FFFFFF"/>
-        <w:tabs>
-          <w:tab w:val="clear" w:pos="720"/>
-          <w:tab w:val="left" w:pos="0" w:leader="none"/>
-        </w:tabs>
-        <w:spacing w:before="0" w:after="0"/>
-        <w:ind w:hanging="283" w:left="1414" w:right="0"/>
-        <w:rPr>
-          <w:rFonts w:ascii="DejaVu Sans" w:hAnsi="DejaVu Sans"/>
-        </w:rPr>
-      </w:pPr>
-      <w:r>
-        <w:rPr>
-          <w:rFonts w:ascii="DejaVu Sans" w:hAnsi="DejaVu Sans"/>
-          <w:color w:val="0E101A"/>
-        </w:rPr>
-        <w:t>Generate an ephemeral public and private key pair and sign the public key with your private key. This signed private key shall then be sent to your peer, who will verify it.</w:t>
-      </w:r>
-    </w:p>
-    <w:p>
-      <w:pPr>
-        <w:pStyle w:val="BodyText"/>
-        <w:numPr>
-          <w:ilvl w:val="1"/>
-          <w:numId w:val="3"/>
-        </w:numPr>
-        <w:shd w:val="clear" w:color="FFFFFF" w:fill="FFFFFF"/>
-        <w:tabs>
-          <w:tab w:val="clear" w:pos="720"/>
-          <w:tab w:val="left" w:pos="0" w:leader="none"/>
-        </w:tabs>
-        <w:spacing w:before="0" w:after="0"/>
-        <w:ind w:hanging="283" w:left="1414" w:right="0"/>
-        <w:rPr>
-          <w:rFonts w:ascii="DejaVu Sans" w:hAnsi="DejaVu Sans"/>
-        </w:rPr>
-      </w:pPr>
-      <w:r>
-        <w:rPr>
-          <w:rFonts w:ascii="DejaVu Sans" w:hAnsi="DejaVu Sans"/>
-          <w:color w:val="0E101A"/>
-        </w:rPr>
-        <w:t>Receive a signed, ephemeral public key from your peer and verify the signature.</w:t>
-      </w:r>
-    </w:p>
-    <w:p>
-      <w:pPr>
-        <w:pStyle w:val="BodyText"/>
-        <w:numPr>
-          <w:ilvl w:val="1"/>
-          <w:numId w:val="3"/>
-        </w:numPr>
-        <w:shd w:val="clear" w:color="FFFFFF" w:fill="FFFFFF"/>
-        <w:tabs>
-          <w:tab w:val="clear" w:pos="720"/>
-          <w:tab w:val="left" w:pos="0" w:leader="none"/>
-        </w:tabs>
-        <w:spacing w:before="0" w:after="0"/>
-        <w:ind w:hanging="283" w:left="1414" w:right="0"/>
-        <w:rPr>
-          <w:rFonts w:ascii="DejaVu Sans" w:hAnsi="DejaVu Sans"/>
-        </w:rPr>
-      </w:pPr>
-      <w:r>
-        <w:rPr>
-          <w:rFonts w:ascii="DejaVu Sans" w:hAnsi="DejaVu Sans"/>
-          <w:color w:val="0E101A"/>
-        </w:rPr>
-        <w:t xml:space="preserve">Do a key exchange using your </w:t>
-      </w:r>
-      <w:bookmarkStart w:id="0" w:name="__DdeLink__86_3387128003"/>
-      <w:r>
-        <w:rPr>
-          <w:rFonts w:ascii="DejaVu Sans" w:hAnsi="DejaVu Sans"/>
-          <w:color w:val="0E101A"/>
-        </w:rPr>
-        <w:t>ephemeral private key</w:t>
-      </w:r>
-      <w:bookmarkEnd w:id="0"/>
-      <w:r>
-        <w:rPr>
-          <w:rFonts w:ascii="DejaVu Sans" w:hAnsi="DejaVu Sans"/>
-          <w:color w:val="0E101A"/>
-        </w:rPr>
-        <w:t xml:space="preserve"> and your peer's ephemeral public key.</w:t>
-      </w:r>
-    </w:p>
-    <w:p>
-      <w:pPr>
-        <w:pStyle w:val="BodyText"/>
-        <w:numPr>
-          <w:ilvl w:val="1"/>
-          <w:numId w:val="3"/>
-        </w:numPr>
-        <w:shd w:val="clear" w:color="FFFFFF" w:fill="FFFFFF"/>
-        <w:tabs>
-          <w:tab w:val="clear" w:pos="720"/>
-          <w:tab w:val="left" w:pos="0" w:leader="none"/>
-        </w:tabs>
-        <w:spacing w:before="0" w:after="0"/>
-        <w:ind w:hanging="283" w:left="1414" w:right="0"/>
-        <w:rPr>
-          <w:rFonts w:ascii="DejaVu Sans" w:hAnsi="DejaVu Sans"/>
-        </w:rPr>
-      </w:pPr>
-      <w:r>
-        <w:rPr>
-          <w:rFonts w:ascii="DejaVu Sans" w:hAnsi="DejaVu Sans"/>
-          <w:color w:val="0E101A"/>
-        </w:rPr>
-        <w:t>As an energy seller, use the resulting shared secret to first decrypt an encrypted purchase request from your peer (the energy buyer), compute and encrypt the price for the request (encryption and decryption using an authenticated encryption mechanism) and send it back to your peer.</w:t>
+        <w:rPr/>
       </w:r>
     </w:p>
     <w:sectPr>
-      <w:headerReference w:type="even" r:id="rId5"/>
-      <w:headerReference w:type="default" r:id="rId6"/>
-      <w:headerReference w:type="first" r:id="rId7"/>
-      <w:footerReference w:type="even" r:id="rId8"/>
-      <w:footerReference w:type="default" r:id="rId9"/>
-      <w:footerReference w:type="first" r:id="rId10"/>
+      <w:headerReference w:type="even" r:id="rId4"/>
+      <w:headerReference w:type="default" r:id="rId5"/>
+      <w:headerReference w:type="first" r:id="rId6"/>
+      <w:footerReference w:type="even" r:id="rId7"/>
+      <w:footerReference w:type="default" r:id="rId8"/>
+      <w:footerReference w:type="first" r:id="rId9"/>
       <w:type w:val="nextPage"/>
       <w:pgSz w:w="11906" w:h="16838"/>
       <w:pgMar w:left="1134" w:right="1418" w:gutter="0" w:header="709" w:top="1418" w:footer="709" w:bottom="1134"/>
@@ -1141,56 +718,10 @@
     </w:pPr>
     <w:r>
       <w:rPr/>
-      <w:drawing>
-        <wp:anchor distT="0" distB="0" distL="0" distR="0" simplePos="0" relativeHeight="2" behindDoc="1" locked="0" layoutInCell="1" allowOverlap="1">
-          <wp:simplePos x="0" y="0"/>
-          <wp:positionH relativeFrom="column">
-            <wp:posOffset>635</wp:posOffset>
-          </wp:positionH>
-          <wp:positionV relativeFrom="paragraph">
-            <wp:posOffset>275590</wp:posOffset>
-          </wp:positionV>
-          <wp:extent cx="2445385" cy="318770"/>
-          <wp:effectExtent l="0" t="0" r="0" b="0"/>
-          <wp:wrapNone/>
-          <wp:docPr id="6" name="Picture 1"/>
-          <wp:cNvGraphicFramePr>
-            <a:graphicFrameLocks xmlns:a="http://schemas.openxmlformats.org/drawingml/2006/main" noChangeAspect="1"/>
-          </wp:cNvGraphicFramePr>
-          <a:graphic xmlns:a="http://schemas.openxmlformats.org/drawingml/2006/main">
-            <a:graphicData uri="http://schemas.openxmlformats.org/drawingml/2006/picture">
-              <pic:pic xmlns:pic="http://schemas.openxmlformats.org/drawingml/2006/picture">
-                <pic:nvPicPr>
-                  <pic:cNvPr id="6" name="Picture 1"/>
-                  <pic:cNvPicPr>
-                    <a:picLocks noChangeAspect="1" noChangeArrowheads="1"/>
-                  </pic:cNvPicPr>
-                </pic:nvPicPr>
-                <pic:blipFill>
-                  <a:blip r:embed="rId1"/>
-                  <a:stretch>
-                    <a:fillRect/>
-                  </a:stretch>
-                </pic:blipFill>
-                <pic:spPr bwMode="auto">
-                  <a:xfrm>
-                    <a:off x="0" y="0"/>
-                    <a:ext cx="2445385" cy="318770"/>
-                  </a:xfrm>
-                  <a:prstGeom prst="rect">
-                    <a:avLst/>
-                  </a:prstGeom>
-                  <a:noFill/>
-                </pic:spPr>
-              </pic:pic>
-            </a:graphicData>
-          </a:graphic>
-        </wp:anchor>
-      </w:drawing>
       <mc:AlternateContent>
         <mc:Choice Requires="wps">
           <w:drawing>
-            <wp:anchor distT="0" distB="0" distL="0" distR="0" simplePos="0" relativeHeight="3" behindDoc="1" locked="0" layoutInCell="0" allowOverlap="1">
+            <wp:anchor distT="0" distB="0" distL="0" distR="0" simplePos="0" relativeHeight="2" behindDoc="1" locked="0" layoutInCell="0" allowOverlap="1">
               <wp:simplePos x="0" y="0"/>
               <wp:positionH relativeFrom="margin">
                 <wp:align>right</wp:align>
@@ -1201,7 +732,7 @@
               <wp:extent cx="22860" cy="235585"/>
               <wp:effectExtent l="0" t="0" r="0" b="0"/>
               <wp:wrapNone/>
-              <wp:docPr id="7" name="Frame1"/>
+              <wp:docPr id="6" name="Frame1"/>
               <a:graphic xmlns:a="http://schemas.openxmlformats.org/drawingml/2006/main">
                 <a:graphicData uri="http://schemas.microsoft.com/office/word/2010/wordprocessingShape">
                   <wps:wsp>
@@ -1338,6 +869,51 @@
           </w:pict>
         </mc:Fallback>
       </mc:AlternateContent>
+      <w:drawing>
+        <wp:anchor distT="0" distB="0" distL="0" distR="0" simplePos="0" relativeHeight="0" behindDoc="1" locked="0" layoutInCell="1" allowOverlap="1">
+          <wp:simplePos x="0" y="0"/>
+          <wp:positionH relativeFrom="column">
+            <wp:posOffset>635</wp:posOffset>
+          </wp:positionH>
+          <wp:positionV relativeFrom="paragraph">
+            <wp:posOffset>275590</wp:posOffset>
+          </wp:positionV>
+          <wp:extent cx="2445385" cy="318770"/>
+          <wp:effectExtent l="0" t="0" r="0" b="0"/>
+          <wp:wrapNone/>
+          <wp:docPr id="7" name="Picture 1"/>
+          <wp:cNvGraphicFramePr>
+            <a:graphicFrameLocks xmlns:a="http://schemas.openxmlformats.org/drawingml/2006/main" noChangeAspect="1"/>
+          </wp:cNvGraphicFramePr>
+          <a:graphic xmlns:a="http://schemas.openxmlformats.org/drawingml/2006/main">
+            <a:graphicData uri="http://schemas.openxmlformats.org/drawingml/2006/picture">
+              <pic:pic xmlns:pic="http://schemas.openxmlformats.org/drawingml/2006/picture">
+                <pic:nvPicPr>
+                  <pic:cNvPr id="7" name="Picture 1"/>
+                  <pic:cNvPicPr>
+                    <a:picLocks noChangeAspect="1" noChangeArrowheads="1"/>
+                  </pic:cNvPicPr>
+                </pic:nvPicPr>
+                <pic:blipFill>
+                  <a:blip r:embed="rId1"/>
+                  <a:stretch>
+                    <a:fillRect/>
+                  </a:stretch>
+                </pic:blipFill>
+                <pic:spPr bwMode="auto">
+                  <a:xfrm>
+                    <a:off x="0" y="0"/>
+                    <a:ext cx="2445385" cy="318770"/>
+                  </a:xfrm>
+                  <a:prstGeom prst="rect">
+                    <a:avLst/>
+                  </a:prstGeom>
+                </pic:spPr>
+              </pic:pic>
+            </a:graphicData>
+          </a:graphic>
+        </wp:anchor>
+      </w:drawing>
     </w:r>
   </w:p>
 </w:ftr>
@@ -1355,7 +931,7 @@
     <w:r>
       <w:rPr/>
       <w:drawing>
-        <wp:anchor distT="0" distB="0" distL="0" distR="0" simplePos="0" relativeHeight="5" behindDoc="1" locked="0" layoutInCell="1" allowOverlap="1">
+        <wp:anchor distT="0" distB="0" distL="0" distR="0" simplePos="0" relativeHeight="3" behindDoc="1" locked="0" layoutInCell="1" allowOverlap="1">
           <wp:simplePos x="0" y="0"/>
           <wp:positionH relativeFrom="column">
             <wp:posOffset>-540385</wp:posOffset>
@@ -1438,7 +1014,7 @@
         <w:b/>
       </w:rPr>
       <w:drawing>
-        <wp:anchor distT="0" distB="0" distL="114300" distR="114300" simplePos="0" relativeHeight="7" behindDoc="0" locked="0" layoutInCell="0" allowOverlap="1">
+        <wp:anchor distT="0" distB="0" distL="114300" distR="114300" simplePos="0" relativeHeight="0" behindDoc="0" locked="0" layoutInCell="1" allowOverlap="1">
           <wp:simplePos x="0" y="0"/>
           <wp:positionH relativeFrom="column">
             <wp:posOffset>3967480</wp:posOffset>
@@ -1452,10 +1028,10 @@
             <wp:wrapPolygon edited="0">
               <wp:start x="-69" y="0"/>
               <wp:lineTo x="-69" y="20692"/>
-              <wp:lineTo x="21424" y="20692"/>
-              <wp:lineTo x="21424" y="8893"/>
-              <wp:lineTo x="4049" y="8893"/>
-              <wp:lineTo x="4049" y="0"/>
+              <wp:lineTo x="21423" y="20692"/>
+              <wp:lineTo x="21423" y="8893"/>
+              <wp:lineTo x="4048" y="8893"/>
+              <wp:lineTo x="4048" y="0"/>
               <wp:lineTo x="-69" y="0"/>
             </wp:wrapPolygon>
           </wp:wrapTight>
@@ -1486,7 +1062,6 @@
                   <a:prstGeom prst="rect">
                     <a:avLst/>
                   </a:prstGeom>
-                  <a:noFill/>
                 </pic:spPr>
               </pic:pic>
             </a:graphicData>
@@ -1514,7 +1089,7 @@
     <w:r>
       <w:rPr/>
       <w:drawing>
-        <wp:anchor distT="0" distB="0" distL="0" distR="114300" simplePos="0" relativeHeight="6" behindDoc="0" locked="0" layoutInCell="0" allowOverlap="1">
+        <wp:anchor distT="0" distB="0" distL="0" distR="114300" simplePos="0" relativeHeight="4" behindDoc="0" locked="0" layoutInCell="0" allowOverlap="1">
           <wp:simplePos x="0" y="0"/>
           <wp:positionH relativeFrom="page">
             <wp:align>left</wp:align>
@@ -1528,10 +1103,10 @@
             <wp:wrapPolygon edited="0">
               <wp:start x="-69" y="0"/>
               <wp:lineTo x="-69" y="20996"/>
-              <wp:lineTo x="21452" y="20996"/>
-              <wp:lineTo x="21452" y="9310"/>
-              <wp:lineTo x="4049" y="7079"/>
-              <wp:lineTo x="4049" y="0"/>
+              <wp:lineTo x="21451" y="20996"/>
+              <wp:lineTo x="21451" y="9310"/>
+              <wp:lineTo x="4048" y="7079"/>
+              <wp:lineTo x="4048" y="0"/>
               <wp:lineTo x="-69" y="0"/>
             </wp:wrapPolygon>
           </wp:wrapTight>
@@ -1843,133 +1418,11 @@
       </w:rPr>
     </w:lvl>
   </w:abstractNum>
-  <w:abstractNum w:abstractNumId="3">
-    <w:lvl w:ilvl="0">
-      <w:start w:val="1"/>
-      <w:numFmt w:val="decimal"/>
-      <w:lvlText w:val="%1."/>
-      <w:lvlJc w:val="left"/>
-      <w:pPr>
-        <w:tabs>
-          <w:tab w:val="num" w:pos="707"/>
-        </w:tabs>
-        <w:ind w:left="707" w:hanging="283"/>
-      </w:pPr>
-      <w:rPr/>
-    </w:lvl>
-    <w:lvl w:ilvl="1">
-      <w:start w:val="1"/>
-      <w:numFmt w:val="decimal"/>
-      <w:lvlText w:val="%2."/>
-      <w:lvlJc w:val="left"/>
-      <w:pPr>
-        <w:tabs>
-          <w:tab w:val="num" w:pos="1414"/>
-        </w:tabs>
-        <w:ind w:left="1414" w:hanging="283"/>
-      </w:pPr>
-      <w:rPr/>
-    </w:lvl>
-    <w:lvl w:ilvl="2">
-      <w:start w:val="1"/>
-      <w:numFmt w:val="decimal"/>
-      <w:lvlText w:val="%3."/>
-      <w:lvlJc w:val="left"/>
-      <w:pPr>
-        <w:tabs>
-          <w:tab w:val="num" w:pos="2121"/>
-        </w:tabs>
-        <w:ind w:left="2121" w:hanging="283"/>
-      </w:pPr>
-      <w:rPr/>
-    </w:lvl>
-    <w:lvl w:ilvl="3">
-      <w:start w:val="1"/>
-      <w:numFmt w:val="decimal"/>
-      <w:lvlText w:val="%4."/>
-      <w:lvlJc w:val="left"/>
-      <w:pPr>
-        <w:tabs>
-          <w:tab w:val="num" w:pos="2828"/>
-        </w:tabs>
-        <w:ind w:left="2828" w:hanging="283"/>
-      </w:pPr>
-      <w:rPr/>
-    </w:lvl>
-    <w:lvl w:ilvl="4">
-      <w:start w:val="1"/>
-      <w:numFmt w:val="decimal"/>
-      <w:lvlText w:val="%5."/>
-      <w:lvlJc w:val="left"/>
-      <w:pPr>
-        <w:tabs>
-          <w:tab w:val="num" w:pos="3535"/>
-        </w:tabs>
-        <w:ind w:left="3535" w:hanging="283"/>
-      </w:pPr>
-      <w:rPr/>
-    </w:lvl>
-    <w:lvl w:ilvl="5">
-      <w:start w:val="1"/>
-      <w:numFmt w:val="decimal"/>
-      <w:lvlText w:val="%6."/>
-      <w:lvlJc w:val="left"/>
-      <w:pPr>
-        <w:tabs>
-          <w:tab w:val="num" w:pos="4242"/>
-        </w:tabs>
-        <w:ind w:left="4242" w:hanging="283"/>
-      </w:pPr>
-      <w:rPr/>
-    </w:lvl>
-    <w:lvl w:ilvl="6">
-      <w:start w:val="1"/>
-      <w:numFmt w:val="decimal"/>
-      <w:lvlText w:val="%7."/>
-      <w:lvlJc w:val="left"/>
-      <w:pPr>
-        <w:tabs>
-          <w:tab w:val="num" w:pos="4949"/>
-        </w:tabs>
-        <w:ind w:left="4949" w:hanging="283"/>
-      </w:pPr>
-      <w:rPr/>
-    </w:lvl>
-    <w:lvl w:ilvl="7">
-      <w:start w:val="1"/>
-      <w:numFmt w:val="decimal"/>
-      <w:lvlText w:val="%8."/>
-      <w:lvlJc w:val="left"/>
-      <w:pPr>
-        <w:tabs>
-          <w:tab w:val="num" w:pos="5656"/>
-        </w:tabs>
-        <w:ind w:left="5656" w:hanging="283"/>
-      </w:pPr>
-      <w:rPr/>
-    </w:lvl>
-    <w:lvl w:ilvl="8">
-      <w:start w:val="1"/>
-      <w:numFmt w:val="decimal"/>
-      <w:lvlText w:val="%9."/>
-      <w:lvlJc w:val="left"/>
-      <w:pPr>
-        <w:tabs>
-          <w:tab w:val="num" w:pos="6363"/>
-        </w:tabs>
-        <w:ind w:left="6363" w:hanging="283"/>
-      </w:pPr>
-      <w:rPr/>
-    </w:lvl>
-  </w:abstractNum>
   <w:num w:numId="1">
     <w:abstractNumId w:val="1"/>
   </w:num>
   <w:num w:numId="2">
     <w:abstractNumId w:val="2"/>
-  </w:num>
-  <w:num w:numId="3">
-    <w:abstractNumId w:val="3"/>
   </w:num>
 </w:numbering>
 </file>
@@ -2365,8 +1818,8 @@
       <w:szCs w:val="21"/>
     </w:rPr>
   </w:style>
-  <w:style w:type="character" w:styleId="FootnoteCharacters">
-    <w:name w:val="Footnote Characters"/>
+  <w:style w:type="character" w:styleId="FootnoteCharactersuser">
+    <w:name w:val="Footnote Characters (user)"/>
     <w:basedOn w:val="DefaultParagraphFont"/>
     <w:uiPriority w:val="99"/>
     <w:unhideWhenUsed/>
@@ -2375,8 +1828,8 @@
       <w:vertAlign w:val="superscript"/>
     </w:rPr>
   </w:style>
-  <w:style w:type="character" w:styleId="FootnoteCharactersuser">
-    <w:name w:val="Footnote Characters (user)"/>
+  <w:style w:type="character" w:styleId="FootnoteCharacters">
+    <w:name w:val="Footnote Characters"/>
     <w:qFormat/>
     <w:rPr>
       <w:vertAlign w:val="superscript"/>
@@ -2388,8 +1841,8 @@
       <w:vertAlign w:val="superscript"/>
     </w:rPr>
   </w:style>
-  <w:style w:type="character" w:styleId="EndnoteCharacters">
-    <w:name w:val="Endnote Characters"/>
+  <w:style w:type="character" w:styleId="EndnoteCharactersuser">
+    <w:name w:val="Endnote Characters (user)"/>
     <w:basedOn w:val="DefaultParagraphFont"/>
     <w:uiPriority w:val="99"/>
     <w:semiHidden/>
@@ -2399,8 +1852,8 @@
       <w:vertAlign w:val="superscript"/>
     </w:rPr>
   </w:style>
-  <w:style w:type="character" w:styleId="EndnoteCharactersuser">
-    <w:name w:val="Endnote Characters (user)"/>
+  <w:style w:type="character" w:styleId="EndnoteCharacters">
+    <w:name w:val="Endnote Characters"/>
     <w:qFormat/>
     <w:rPr>
       <w:vertAlign w:val="superscript"/>
@@ -2913,8 +2366,8 @@
       <w:lang w:eastAsia="de-DE"/>
     </w:rPr>
   </w:style>
-  <w:style w:type="character" w:styleId="Bullets">
-    <w:name w:val="Bullets"/>
+  <w:style w:type="character" w:styleId="Bulletsuser">
+    <w:name w:val="Bullets (user)"/>
     <w:qFormat/>
     <w:rPr>
       <w:rFonts w:ascii="OpenSymbol" w:hAnsi="OpenSymbol" w:eastAsia="OpenSymbol" w:cs="OpenSymbol"/>
@@ -3524,8 +2977,8 @@
       <w:lang w:eastAsia="de-DE"/>
     </w:rPr>
   </w:style>
-  <w:style w:type="paragraph" w:styleId="FrameContents">
-    <w:name w:val="Frame Contents"/>
+  <w:style w:type="paragraph" w:styleId="FrameContentsuser">
+    <w:name w:val="Frame Contents (user)"/>
     <w:basedOn w:val="Normal"/>
     <w:qFormat/>
     <w:pPr>
@@ -3533,8 +2986,8 @@
     </w:pPr>
     <w:rPr/>
   </w:style>
-  <w:style w:type="paragraph" w:styleId="BlockQuotation">
-    <w:name w:val="Block Quotation"/>
+  <w:style w:type="paragraph" w:styleId="BlockQuotationuser">
+    <w:name w:val="Block Quotation (user)"/>
     <w:basedOn w:val="Normal"/>
     <w:qFormat/>
     <w:pPr>
@@ -3544,8 +2997,8 @@
     </w:pPr>
     <w:rPr/>
   </w:style>
-  <w:style w:type="paragraph" w:styleId="FrameContentsuser">
-    <w:name w:val="Frame Contents (user)"/>
+  <w:style w:type="paragraph" w:styleId="FrameContents">
+    <w:name w:val="Frame Contents"/>
     <w:basedOn w:val="Normal"/>
     <w:qFormat/>
     <w:pPr/>

</xml_diff>